<commit_message>
Update CV Word document
Replace existing .docx file with updated curriculum vitae
</commit_message>
<xml_diff>
--- a/Yahya Ibrahim Hassan CV.docx
+++ b/Yahya Ibrahim Hassan CV.docx
@@ -618,6 +618,55 @@
                 <w:szCs w:val="22"/>
               </w:rPr>
               <w:t>.</w:t>
+            </w:r>
+          </w:p>
+          <w:p>
+            <w:pPr>
+              <w:rPr>
+                <w:rFonts w:ascii="Times New Roman" w:hAnsi="Times New Roman"/>
+                <w:sz w:val="22"/>
+                <w:szCs w:val="22"/>
+              </w:rPr>
+            </w:pPr>
+            <w:r>
+              <w:rPr>
+                <w:rFonts w:ascii="Times New Roman" w:hAnsi="Times New Roman"/>
+                <w:sz w:val="22"/>
+                <w:szCs w:val="22"/>
+              </w:rPr>
+              <w:t xml:space="preserve">Bachelor's thesis dealt with </w:t>
+            </w:r>
+            <w:r>
+              <w:rPr>
+                <w:rFonts w:ascii="Times New Roman" w:hAnsi="Times New Roman"/>
+                <w:sz w:val="22"/>
+                <w:szCs w:val="22"/>
+              </w:rPr>
+              <w:t xml:space="preserve">bioinformatics </w:t>
+            </w:r>
+            <w:r>
+              <w:rPr>
+                <w:rFonts w:ascii="Times New Roman" w:hAnsi="Times New Roman"/>
+                <w:sz w:val="22"/>
+                <w:szCs w:val="22"/>
+              </w:rPr>
+              <w:t xml:space="preserve">approaches to identify potential diagnostic and therapeutic biomarkers in cervical cancer. Used microarray expression data (GSE63514 / GPL570 platform) from NCBI GEO to </w:t>
+            </w:r>
+            <w:r>
+              <w:rPr>
+                <w:rFonts w:ascii="Times New Roman" w:hAnsi="Times New Roman"/>
+                <w:sz w:val="22"/>
+                <w:szCs w:val="22"/>
+              </w:rPr>
+              <w:t>analyse</w:t>
+            </w:r>
+            <w:r>
+              <w:rPr>
+                <w:rFonts w:ascii="Times New Roman" w:hAnsi="Times New Roman"/>
+                <w:sz w:val="22"/>
+                <w:szCs w:val="22"/>
+              </w:rPr>
+              <w:t xml:space="preserve"> 128 tissue samples (11 cancer vs. 11 normal controls). Identified 155 differentially expressed genes (DEGs) and 6 core hub genes (CDKN2A, CXCR4, CRNN, SPINK5, GBP6, IFI44) via R/Bioconductor and protein-protein interaction network profiling.</w:t>
             </w:r>
           </w:p>
           <w:p>
@@ -4679,6 +4728,24 @@
       <w:shd w:val="clear" w:color="auto" w:fill="E1DFDD"/>
     </w:rPr>
   </w:style>
+  <w:style w:type="paragraph" w:styleId="NormalWeb">
+    <w:name w:val="Normal (Web)"/>
+    <w:basedOn w:val="Normal"/>
+    <w:uiPriority w:val="99"/>
+    <w:semiHidden/>
+    <w:unhideWhenUsed/>
+    <w:rsid w:val="005A1668"/>
+    <w:pPr>
+      <w:spacing w:before="100" w:beforeAutospacing="1" w:after="100" w:afterAutospacing="1" w:line="240" w:lineRule="auto"/>
+    </w:pPr>
+    <w:rPr>
+      <w:rFonts w:ascii="Times New Roman" w:eastAsiaTheme="minorEastAsia" w:hAnsi="Times New Roman"/>
+      <w:color w:val="auto"/>
+      <w:sz w:val="24"/>
+      <w:szCs w:val="24"/>
+      <w:lang w:eastAsia="en-GB"/>
+    </w:rPr>
+  </w:style>
 </w:styles>
 </file>
 
@@ -4846,19 +4913,19 @@
     <w:pitch w:val="variable"/>
     <w:sig w:usb0="E1002EFF" w:usb1="C000605B" w:usb2="00000029" w:usb3="00000000" w:csb0="000101FF" w:csb1="00000000"/>
   </w:font>
+  <w:font w:name="MS PGothic">
+    <w:panose1 w:val="020B0600070205080204"/>
+    <w:charset w:val="80"/>
+    <w:family w:val="swiss"/>
+    <w:pitch w:val="variable"/>
+    <w:sig w:usb0="E00002FF" w:usb1="6AC7FDFB" w:usb2="08000012" w:usb3="00000000" w:csb0="0002009F" w:csb1="00000000"/>
+  </w:font>
   <w:font w:name="HGMinchoE">
     <w:panose1 w:val="02020809000000000000"/>
     <w:charset w:val="80"/>
     <w:family w:val="modern"/>
     <w:pitch w:val="fixed"/>
     <w:sig w:usb0="E00002FF" w:usb1="2AC7EDFE" w:usb2="00000012" w:usb3="00000000" w:csb0="00020001" w:csb1="00000000"/>
-  </w:font>
-  <w:font w:name="MS PGothic">
-    <w:panose1 w:val="020B0600070205080204"/>
-    <w:charset w:val="80"/>
-    <w:family w:val="swiss"/>
-    <w:pitch w:val="variable"/>
-    <w:sig w:usb0="E00002FF" w:usb1="6AC7FDFB" w:usb2="08000012" w:usb3="00000000" w:csb0="0002009F" w:csb1="00000000"/>
   </w:font>
   <w:font w:name="Arial">
     <w:panose1 w:val="020B0604020202020204"/>
@@ -4870,16 +4937,16 @@
   <w:font w:name="Aptos">
     <w:panose1 w:val="020B0004020202020204"/>
     <w:charset w:val="00"/>
-    <w:family w:val="roman"/>
-    <w:notTrueType/>
-    <w:pitch w:val="default"/>
+    <w:family w:val="swiss"/>
+    <w:pitch w:val="variable"/>
+    <w:sig w:usb0="20000287" w:usb1="00000003" w:usb2="00000000" w:usb3="00000000" w:csb0="0000019F" w:csb1="00000000"/>
   </w:font>
   <w:font w:name="Aptos Display">
     <w:panose1 w:val="020B0004020202020204"/>
     <w:charset w:val="00"/>
-    <w:family w:val="roman"/>
-    <w:notTrueType/>
-    <w:pitch w:val="default"/>
+    <w:family w:val="swiss"/>
+    <w:pitch w:val="variable"/>
+    <w:sig w:usb0="20000287" w:usb1="00000003" w:usb2="00000000" w:usb3="00000000" w:csb0="0000019F" w:csb1="00000000"/>
   </w:font>
 </w:fonts>
 </file>
@@ -4924,12 +4991,14 @@
     <w:rsid w:val="007242A4"/>
     <w:rsid w:val="008345F3"/>
     <w:rsid w:val="008539EA"/>
+    <w:rsid w:val="009D0EE6"/>
     <w:rsid w:val="009E04EA"/>
     <w:rsid w:val="00A56492"/>
     <w:rsid w:val="00B260E8"/>
     <w:rsid w:val="00B364B6"/>
     <w:rsid w:val="00B54EC9"/>
     <w:rsid w:val="00B85BCB"/>
+    <w:rsid w:val="00C0284A"/>
     <w:rsid w:val="00C06BA6"/>
     <w:rsid w:val="00C170CC"/>
     <w:rsid w:val="00C80B07"/>

</xml_diff>

<commit_message>
Update CV document (Yahya Ibrahim Hassan CV.docx)
Replace existing .docx file with updated curriculum vitae.
</commit_message>
<xml_diff>
--- a/Yahya Ibrahim Hassan CV.docx
+++ b/Yahya Ibrahim Hassan CV.docx
@@ -58,6 +58,7 @@
           <w:docPartCategory w:val=" Resume Name"/>
         </w:docPartList>
       </w:sdtPr>
+      <w:sdtEndPr/>
       <w:sdtContent>
         <w:p>
           <w:pPr>
@@ -154,6 +155,7 @@
                     <w:dataBinding w:prefixMappings="xmlns:ns0='http://schemas.openxmlformats.org/package/2006/metadata/core-properties' xmlns:ns1='http://purl.org/dc/elements/1.1/'" w:xpath="/ns0:coreProperties[1]/ns1:creator[1]" w:storeItemID="{6C3C8BC8-F283-45AE-878A-BAB7291924A1}"/>
                     <w:text/>
                   </w:sdtPr>
+                  <w:sdtEndPr/>
                   <w:sdtContent>
                     <w:r>
                       <w:rPr>
@@ -689,7 +691,23 @@
                 <w:sz w:val="22"/>
                 <w:szCs w:val="22"/>
               </w:rPr>
-              <w:t>Relevant courses</w:t>
+              <w:t xml:space="preserve">Relevant </w:t>
+            </w:r>
+            <w:r>
+              <w:rPr>
+                <w:rFonts w:ascii="Times New Roman" w:hAnsi="Times New Roman"/>
+                <w:sz w:val="22"/>
+                <w:szCs w:val="22"/>
+              </w:rPr>
+              <w:t>course</w:t>
+            </w:r>
+            <w:r>
+              <w:rPr>
+                <w:rFonts w:ascii="Times New Roman" w:hAnsi="Times New Roman"/>
+                <w:sz w:val="22"/>
+                <w:szCs w:val="22"/>
+              </w:rPr>
+              <w:t>work</w:t>
             </w:r>
             <w:r>
               <w:rPr>
@@ -881,6 +899,11 @@
                   <w:docPart w:val="B6BAF20A19EE4EBEA463437B7F192E17"/>
                 </w:placeholder>
               </w:sdtPr>
+              <w:sdtEndPr>
+                <w:rPr>
+                  <w:rStyle w:val="SubsectionDateChar"/>
+                </w:rPr>
+              </w:sdtEndPr>
               <w:sdtContent>
                 <w:r>
                   <w:rPr>
@@ -1068,6 +1091,11 @@
                   <w:docPart w:val="FF085E7DEFE34CD781F7AB63B487858D"/>
                 </w:placeholder>
               </w:sdtPr>
+              <w:sdtEndPr>
+                <w:rPr>
+                  <w:rStyle w:val="SubsectionDateChar"/>
+                </w:rPr>
+              </w:sdtEndPr>
               <w:sdtContent>
                 <w:r>
                   <w:rPr>
@@ -2460,6 +2488,7 @@
         <w:id w:val="121446346"/>
         <w:text/>
       </w:sdtPr>
+      <w:sdtEndPr/>
       <w:sdtContent>
         <w:r>
           <w:t>+234 8108416797</w:t>
@@ -2573,6 +2602,7 @@
         <w:dataBinding w:prefixMappings="xmlns:ns0='http://schemas.openxmlformats.org/package/2006/metadata/core-properties' xmlns:ns1='http://purl.org/dc/elements/1.1/'" w:xpath="/ns0:coreProperties[1]/ns1:creator[1]" w:storeItemID="{6C3C8BC8-F283-45AE-878A-BAB7291924A1}"/>
         <w:text/>
       </w:sdtPr>
+      <w:sdtEndPr/>
       <w:sdtContent>
         <w:r>
           <w:t>Yahya Ibrahim Hassan</w:t>
@@ -2605,6 +2635,7 @@
         <w:dataBinding w:prefixMappings="xmlns:ns0='http://schemas.openxmlformats.org/package/2006/metadata/core-properties' xmlns:ns1='http://purl.org/dc/elements/1.1/'" w:xpath="/ns0:coreProperties[1]/ns1:creator[1]" w:storeItemID="{6C3C8BC8-F283-45AE-878A-BAB7291924A1}"/>
         <w:text/>
       </w:sdtPr>
+      <w:sdtEndPr/>
       <w:sdtContent>
         <w:r>
           <w:t>Yahya Ibrahim Hassan</w:t>
@@ -5007,6 +5038,7 @@
     <w:rsid w:val="00C97627"/>
     <w:rsid w:val="00CB5CBE"/>
     <w:rsid w:val="00D24BD1"/>
+    <w:rsid w:val="00D65674"/>
     <w:rsid w:val="00EA712C"/>
     <w:rsid w:val="00FB3645"/>
   </w:rsids>

</xml_diff>